<commit_message>
Correction de renvois dans support LAM et ABS
</commit_message>
<xml_diff>
--- a/_support/supports_par_modules/Couleur/Support_ABS.docx
+++ b/_support/supports_par_modules/Couleur/Support_ABS.docx
@@ -2978,23 +2978,7 @@
           <w:sz w:val="22"/>
           <w:szCs w:val="22"/>
         </w:rPr>
-        <w:t xml:space="preserve">Repérer une duplication est une chose ; la supprimer sans rien casser en est une autre. IntelliJ le fait pour vous (voir </w:t>
-      </w:r>
-      <w:r>
-        <w:rPr>
-          <w:rFonts w:ascii="Consolas" w:hAnsi="Consolas" w:cs="Consolas"/>
-          <w:color w:val="E97132" w:themeColor="accent2"/>
-          <w:sz w:val="18"/>
-          <w:szCs w:val="18"/>
-        </w:rPr>
-        <w:t xml:space="preserve">IDE.21</w:t>
-      </w:r>
-      <w:r>
-        <w:rPr>
-          <w:sz w:val="22"/>
-          <w:szCs w:val="22"/>
-        </w:rPr>
-        <w:t xml:space="preserve">) :</w:t>
+        <w:t xml:space="preserve">Repérer une duplication est une chose ; la supprimer sans rien casser en est une autre. IntelliJ le fait pour vous, avec deux outils de refactorisation :</w:t>
       </w:r>
     </w:p>
     <w:p>

</xml_diff>

<commit_message>
Liste complète de questions Moodle et adaptations modules ABS et GEN
</commit_message>
<xml_diff>
--- a/_support/supports_par_modules/Couleur/Support_ABS.docx
+++ b/_support/supports_par_modules/Couleur/Support_ABS.docx
@@ -69,8 +69,8 @@
     <w:p>
       <w:pPr>
         <w:sectPr>
-          <w:headerReference w:type="default" r:id="rId12"/>
-          <w:footerReference w:type="default" r:id="rId13"/>
+          <w:headerReference w:type="default" r:id="rId13"/>
+          <w:footerReference w:type="default" r:id="rId14"/>
           <w:pgSz w:w="11906" w:h="16838" w:orient="portrait"/>
           <w:pgMar w:top="1440" w:right="1440" w:bottom="1440" w:left="1440" w:header="708" w:footer="708" w:gutter="0"/>
           <w:docGrid w:linePitch="360"/>
@@ -5559,6 +5559,1158 @@
           <w:sz w:val="24"/>
           <w:szCs w:val="24"/>
         </w:rPr>
+        <w:t xml:space="preserve">Quelle version s'exécute, dans une chaîne d'héritage</w:t>
+      </w:r>
+    </w:p>
+    <w:p>
+      <w:pPr>
+        <w:keepNext/>
+        <w:spacing w:after="60" w:before="120"/>
+        <w:jc w:val="center"/>
+      </w:pPr>
+      <w:r>
+        <w:drawing>
+          <wp:inline distT="0" distB="0" distL="0" distR="0">
+            <wp:extent cx="4676775" cy="1743075"/>
+            <wp:effectExtent t="0" r="0" b="0" l="0"/>
+            <wp:docPr id="1" name="" descr="" title=""/>
+            <wp:cNvGraphicFramePr>
+              <a:graphicFrameLocks xmlns:a="http://schemas.openxmlformats.org/drawingml/2006/main" noChangeAspect="1"/>
+            </wp:cNvGraphicFramePr>
+            <a:graphic xmlns:a="http://schemas.openxmlformats.org/drawingml/2006/main">
+              <a:graphicData uri="http://schemas.openxmlformats.org/drawingml/2006/picture">
+                <pic:pic xmlns:pic="http://schemas.openxmlformats.org/drawingml/2006/picture">
+                  <pic:nvPicPr>
+                    <pic:cNvPr id="0" name="" descr=""/>
+                    <pic:cNvPicPr>
+                      <a:picLocks noChangeAspect="1" noChangeArrowheads="1"/>
+                    </pic:cNvPicPr>
+                  </pic:nvPicPr>
+                  <pic:blipFill>
+                    <a:blip r:embed="rId9" cstate="none"/>
+                    <a:srcRect/>
+                    <a:stretch>
+                      <a:fillRect/>
+                    </a:stretch>
+                  </pic:blipFill>
+                  <pic:spPr bwMode="auto">
+                    <a:xfrm>
+                      <a:off x="0" y="0"/>
+                      <a:ext cx="4676775" cy="1743075"/>
+                    </a:xfrm>
+                    <a:prstGeom prst="rect">
+                      <a:avLst/>
+                    </a:prstGeom>
+                  </pic:spPr>
+                </pic:pic>
+              </a:graphicData>
+            </a:graphic>
+          </wp:inline>
+        </w:drawing>
+      </w:r>
+    </w:p>
+    <w:p>
+      <w:pPr>
+        <w:spacing w:after="200"/>
+        <w:jc w:val="center"/>
+      </w:pPr>
+      <w:r>
+        <w:rPr>
+          <w:i/>
+          <w:iCs/>
+          <w:color w:val="595959"/>
+          <w:sz w:val="20"/>
+          <w:szCs w:val="20"/>
+        </w:rPr>
+        <w:t xml:space="preserve">Une méthode </w:t>
+      </w:r>
+      <w:r>
+        <w:rPr>
+          <w:rFonts w:ascii="Consolas" w:hAnsi="Consolas" w:cs="Consolas"/>
+          <w:i/>
+          <w:iCs/>
+          <w:color w:val="E97132" w:themeColor="accent2"/>
+          <w:sz w:val="18"/>
+          <w:szCs w:val="18"/>
+        </w:rPr>
+        <w:t xml:space="preserve">truc()</w:t>
+      </w:r>
+      <w:r>
+        <w:rPr>
+          <w:i/>
+          <w:iCs/>
+          <w:color w:val="595959"/>
+          <w:sz w:val="20"/>
+          <w:szCs w:val="20"/>
+        </w:rPr>
+        <w:t xml:space="preserve"> écrite dans A, redéfinie dans C et dans D</w:t>
+      </w:r>
+    </w:p>
+    <w:p>
+      <w:pPr>
+        <w:spacing w:after="120"/>
+      </w:pPr>
+      <w:r>
+        <w:rPr>
+          <w:sz w:val="22"/>
+          <w:szCs w:val="22"/>
+        </w:rPr>
+        <w:t xml:space="preserve">Quand une méthode est redéfinie à plusieurs étages d'une hiérarchie, Java part de la classe réelle de l'objet et remonte vers ses ancêtres, jusqu'à la première classe qui écrit la méthode. C'est cette version qui s'exécute.</w:t>
+      </w:r>
+    </w:p>
+    <w:tbl>
+      <w:tblPr>
+        <w:tblW w:type="dxa" w:w="9360"/>
+        <w:tblBorders>
+          <w:top w:val="single" w:color="auto" w:sz="4"/>
+          <w:left w:val="single" w:color="auto" w:sz="4"/>
+          <w:bottom w:val="single" w:color="auto" w:sz="4"/>
+          <w:right w:val="single" w:color="auto" w:sz="4"/>
+          <w:insideH w:val="single" w:color="auto" w:sz="4"/>
+          <w:insideV w:val="single" w:color="auto" w:sz="4"/>
+        </w:tblBorders>
+      </w:tblPr>
+      <w:tblGrid>
+        <w:gridCol w:w="2571"/>
+        <w:gridCol w:w="2477"/>
+        <w:gridCol w:w="4312"/>
+      </w:tblGrid>
+      <w:tr>
+        <w:trPr>
+          <w:tblHeader/>
+        </w:trPr>
+        <w:tc>
+          <w:tcPr>
+            <w:tcW w:type="dxa" w:w="2571"/>
+            <w:shd w:fill="DEEAF6" w:val="clear"/>
+            <w:tcMar>
+              <w:top w:type="dxa" w:w="55"/>
+              <w:left w:type="dxa" w:w="100"/>
+              <w:bottom w:type="dxa" w:w="55"/>
+              <w:right w:type="dxa" w:w="100"/>
+            </w:tcMar>
+          </w:tcPr>
+          <w:p>
+            <w:pPr>
+              <w:spacing w:after="0"/>
+            </w:pPr>
+            <w:r>
+              <w:rPr>
+                <w:b/>
+                <w:bCs/>
+                <w:sz w:val="20"/>
+                <w:szCs w:val="20"/>
+              </w:rPr>
+              <w:t xml:space="preserve">Objet de la classe</w:t>
+            </w:r>
+          </w:p>
+        </w:tc>
+        <w:tc>
+          <w:tcPr>
+            <w:tcW w:type="dxa" w:w="2477"/>
+            <w:shd w:fill="DEEAF6" w:val="clear"/>
+            <w:tcMar>
+              <w:top w:type="dxa" w:w="55"/>
+              <w:left w:type="dxa" w:w="100"/>
+              <w:bottom w:type="dxa" w:w="55"/>
+              <w:right w:type="dxa" w:w="100"/>
+            </w:tcMar>
+          </w:tcPr>
+          <w:p>
+            <w:pPr>
+              <w:spacing w:after="0"/>
+            </w:pPr>
+            <w:r>
+              <w:rPr>
+                <w:rFonts w:ascii="Consolas" w:hAnsi="Consolas" w:cs="Consolas"/>
+                <w:b/>
+                <w:bCs/>
+                <w:color w:val="E97132" w:themeColor="accent2"/>
+                <w:sz w:val="18"/>
+                <w:szCs w:val="18"/>
+              </w:rPr>
+              <w:t xml:space="preserve">truc()</w:t>
+            </w:r>
+            <w:r>
+              <w:rPr>
+                <w:b/>
+                <w:bCs/>
+                <w:sz w:val="20"/>
+                <w:szCs w:val="20"/>
+              </w:rPr>
+              <w:t xml:space="preserve"> exécutée</w:t>
+            </w:r>
+          </w:p>
+        </w:tc>
+        <w:tc>
+          <w:tcPr>
+            <w:tcW w:type="dxa" w:w="4312"/>
+            <w:shd w:fill="DEEAF6" w:val="clear"/>
+            <w:tcMar>
+              <w:top w:type="dxa" w:w="55"/>
+              <w:left w:type="dxa" w:w="100"/>
+              <w:bottom w:type="dxa" w:w="55"/>
+              <w:right w:type="dxa" w:w="100"/>
+            </w:tcMar>
+          </w:tcPr>
+          <w:p>
+            <w:pPr>
+              <w:spacing w:after="0"/>
+            </w:pPr>
+            <w:r>
+              <w:rPr>
+                <w:b/>
+                <w:bCs/>
+                <w:sz w:val="20"/>
+                <w:szCs w:val="20"/>
+              </w:rPr>
+              <w:t xml:space="preserve">Pourquoi</w:t>
+            </w:r>
+          </w:p>
+        </w:tc>
+      </w:tr>
+      <w:tr>
+        <w:trPr>
+          <w:cantSplit/>
+        </w:trPr>
+        <w:tc>
+          <w:tcPr>
+            <w:tcW w:type="dxa" w:w="2571"/>
+            <w:tcMar>
+              <w:top w:type="dxa" w:w="55"/>
+              <w:left w:type="dxa" w:w="100"/>
+              <w:bottom w:type="dxa" w:w="55"/>
+              <w:right w:type="dxa" w:w="100"/>
+            </w:tcMar>
+          </w:tcPr>
+          <w:p>
+            <w:pPr>
+              <w:spacing w:after="0"/>
+            </w:pPr>
+            <w:r>
+              <w:rPr>
+                <w:rFonts w:ascii="Consolas" w:hAnsi="Consolas" w:cs="Consolas"/>
+                <w:color w:val="E97132" w:themeColor="accent2"/>
+                <w:sz w:val="18"/>
+                <w:szCs w:val="18"/>
+              </w:rPr>
+              <w:t xml:space="preserve">A</w:t>
+            </w:r>
+          </w:p>
+        </w:tc>
+        <w:tc>
+          <w:tcPr>
+            <w:tcW w:type="dxa" w:w="2477"/>
+            <w:tcMar>
+              <w:top w:type="dxa" w:w="55"/>
+              <w:left w:type="dxa" w:w="100"/>
+              <w:bottom w:type="dxa" w:w="55"/>
+              <w:right w:type="dxa" w:w="100"/>
+            </w:tcMar>
+          </w:tcPr>
+          <w:p>
+            <w:pPr>
+              <w:spacing w:after="0"/>
+            </w:pPr>
+            <w:r>
+              <w:rPr>
+                <w:sz w:val="20"/>
+                <w:szCs w:val="20"/>
+              </w:rPr>
+              <w:t xml:space="preserve">celle de </w:t>
+            </w:r>
+            <w:r>
+              <w:rPr>
+                <w:rFonts w:ascii="Consolas" w:hAnsi="Consolas" w:cs="Consolas"/>
+                <w:color w:val="E97132" w:themeColor="accent2"/>
+                <w:sz w:val="18"/>
+                <w:szCs w:val="18"/>
+              </w:rPr>
+              <w:t xml:space="preserve">A</w:t>
+            </w:r>
+          </w:p>
+        </w:tc>
+        <w:tc>
+          <w:tcPr>
+            <w:tcW w:type="dxa" w:w="4312"/>
+            <w:tcMar>
+              <w:top w:type="dxa" w:w="55"/>
+              <w:left w:type="dxa" w:w="100"/>
+              <w:bottom w:type="dxa" w:w="55"/>
+              <w:right w:type="dxa" w:w="100"/>
+            </w:tcMar>
+          </w:tcPr>
+          <w:p>
+            <w:pPr>
+              <w:spacing w:after="0"/>
+            </w:pPr>
+            <w:r>
+              <w:rPr>
+                <w:rFonts w:ascii="Consolas" w:hAnsi="Consolas" w:cs="Consolas"/>
+                <w:color w:val="E97132" w:themeColor="accent2"/>
+                <w:sz w:val="18"/>
+                <w:szCs w:val="18"/>
+              </w:rPr>
+              <w:t xml:space="preserve">A</w:t>
+            </w:r>
+            <w:r>
+              <w:rPr>
+                <w:sz w:val="20"/>
+                <w:szCs w:val="20"/>
+              </w:rPr>
+              <w:t xml:space="preserve"> l'écrit</w:t>
+            </w:r>
+          </w:p>
+        </w:tc>
+      </w:tr>
+      <w:tr>
+        <w:trPr>
+          <w:cantSplit/>
+        </w:trPr>
+        <w:tc>
+          <w:tcPr>
+            <w:tcW w:type="dxa" w:w="2571"/>
+            <w:tcMar>
+              <w:top w:type="dxa" w:w="55"/>
+              <w:left w:type="dxa" w:w="100"/>
+              <w:bottom w:type="dxa" w:w="55"/>
+              <w:right w:type="dxa" w:w="100"/>
+            </w:tcMar>
+          </w:tcPr>
+          <w:p>
+            <w:pPr>
+              <w:spacing w:after="0"/>
+            </w:pPr>
+            <w:r>
+              <w:rPr>
+                <w:rFonts w:ascii="Consolas" w:hAnsi="Consolas" w:cs="Consolas"/>
+                <w:color w:val="E97132" w:themeColor="accent2"/>
+                <w:sz w:val="18"/>
+                <w:szCs w:val="18"/>
+              </w:rPr>
+              <w:t xml:space="preserve">B</w:t>
+            </w:r>
+          </w:p>
+        </w:tc>
+        <w:tc>
+          <w:tcPr>
+            <w:tcW w:type="dxa" w:w="2477"/>
+            <w:tcMar>
+              <w:top w:type="dxa" w:w="55"/>
+              <w:left w:type="dxa" w:w="100"/>
+              <w:bottom w:type="dxa" w:w="55"/>
+              <w:right w:type="dxa" w:w="100"/>
+            </w:tcMar>
+          </w:tcPr>
+          <w:p>
+            <w:pPr>
+              <w:spacing w:after="0"/>
+            </w:pPr>
+            <w:r>
+              <w:rPr>
+                <w:sz w:val="20"/>
+                <w:szCs w:val="20"/>
+              </w:rPr>
+              <w:t xml:space="preserve">celle de </w:t>
+            </w:r>
+            <w:r>
+              <w:rPr>
+                <w:rFonts w:ascii="Consolas" w:hAnsi="Consolas" w:cs="Consolas"/>
+                <w:color w:val="E97132" w:themeColor="accent2"/>
+                <w:sz w:val="18"/>
+                <w:szCs w:val="18"/>
+              </w:rPr>
+              <w:t xml:space="preserve">A</w:t>
+            </w:r>
+          </w:p>
+        </w:tc>
+        <w:tc>
+          <w:tcPr>
+            <w:tcW w:type="dxa" w:w="4312"/>
+            <w:tcMar>
+              <w:top w:type="dxa" w:w="55"/>
+              <w:left w:type="dxa" w:w="100"/>
+              <w:bottom w:type="dxa" w:w="55"/>
+              <w:right w:type="dxa" w:w="100"/>
+            </w:tcMar>
+          </w:tcPr>
+          <w:p>
+            <w:pPr>
+              <w:spacing w:after="0"/>
+            </w:pPr>
+            <w:r>
+              <w:rPr>
+                <w:rFonts w:ascii="Consolas" w:hAnsi="Consolas" w:cs="Consolas"/>
+                <w:color w:val="E97132" w:themeColor="accent2"/>
+                <w:sz w:val="18"/>
+                <w:szCs w:val="18"/>
+              </w:rPr>
+              <w:t xml:space="preserve">B</w:t>
+            </w:r>
+            <w:r>
+              <w:rPr>
+                <w:sz w:val="20"/>
+                <w:szCs w:val="20"/>
+              </w:rPr>
+              <w:t xml:space="preserve"> ne l'écrit pas : on remonte à </w:t>
+            </w:r>
+            <w:r>
+              <w:rPr>
+                <w:rFonts w:ascii="Consolas" w:hAnsi="Consolas" w:cs="Consolas"/>
+                <w:color w:val="E97132" w:themeColor="accent2"/>
+                <w:sz w:val="18"/>
+                <w:szCs w:val="18"/>
+              </w:rPr>
+              <w:t xml:space="preserve">A</w:t>
+            </w:r>
+          </w:p>
+        </w:tc>
+      </w:tr>
+      <w:tr>
+        <w:trPr>
+          <w:cantSplit/>
+        </w:trPr>
+        <w:tc>
+          <w:tcPr>
+            <w:tcW w:type="dxa" w:w="2571"/>
+            <w:tcMar>
+              <w:top w:type="dxa" w:w="55"/>
+              <w:left w:type="dxa" w:w="100"/>
+              <w:bottom w:type="dxa" w:w="55"/>
+              <w:right w:type="dxa" w:w="100"/>
+            </w:tcMar>
+          </w:tcPr>
+          <w:p>
+            <w:pPr>
+              <w:spacing w:after="0"/>
+            </w:pPr>
+            <w:r>
+              <w:rPr>
+                <w:rFonts w:ascii="Consolas" w:hAnsi="Consolas" w:cs="Consolas"/>
+                <w:color w:val="E97132" w:themeColor="accent2"/>
+                <w:sz w:val="18"/>
+                <w:szCs w:val="18"/>
+              </w:rPr>
+              <w:t xml:space="preserve">C</w:t>
+            </w:r>
+          </w:p>
+        </w:tc>
+        <w:tc>
+          <w:tcPr>
+            <w:tcW w:type="dxa" w:w="2477"/>
+            <w:tcMar>
+              <w:top w:type="dxa" w:w="55"/>
+              <w:left w:type="dxa" w:w="100"/>
+              <w:bottom w:type="dxa" w:w="55"/>
+              <w:right w:type="dxa" w:w="100"/>
+            </w:tcMar>
+          </w:tcPr>
+          <w:p>
+            <w:pPr>
+              <w:spacing w:after="0"/>
+            </w:pPr>
+            <w:r>
+              <w:rPr>
+                <w:sz w:val="20"/>
+                <w:szCs w:val="20"/>
+              </w:rPr>
+              <w:t xml:space="preserve">celle de </w:t>
+            </w:r>
+            <w:r>
+              <w:rPr>
+                <w:rFonts w:ascii="Consolas" w:hAnsi="Consolas" w:cs="Consolas"/>
+                <w:color w:val="E97132" w:themeColor="accent2"/>
+                <w:sz w:val="18"/>
+                <w:szCs w:val="18"/>
+              </w:rPr>
+              <w:t xml:space="preserve">C</w:t>
+            </w:r>
+          </w:p>
+        </w:tc>
+        <w:tc>
+          <w:tcPr>
+            <w:tcW w:type="dxa" w:w="4312"/>
+            <w:tcMar>
+              <w:top w:type="dxa" w:w="55"/>
+              <w:left w:type="dxa" w:w="100"/>
+              <w:bottom w:type="dxa" w:w="55"/>
+              <w:right w:type="dxa" w:w="100"/>
+            </w:tcMar>
+          </w:tcPr>
+          <w:p>
+            <w:pPr>
+              <w:spacing w:after="0"/>
+            </w:pPr>
+            <w:r>
+              <w:rPr>
+                <w:rFonts w:ascii="Consolas" w:hAnsi="Consolas" w:cs="Consolas"/>
+                <w:color w:val="E97132" w:themeColor="accent2"/>
+                <w:sz w:val="18"/>
+                <w:szCs w:val="18"/>
+              </w:rPr>
+              <w:t xml:space="preserve">C</w:t>
+            </w:r>
+            <w:r>
+              <w:rPr>
+                <w:sz w:val="20"/>
+                <w:szCs w:val="20"/>
+              </w:rPr>
+              <w:t xml:space="preserve"> la redéfinit</w:t>
+            </w:r>
+          </w:p>
+        </w:tc>
+      </w:tr>
+      <w:tr>
+        <w:trPr>
+          <w:cantSplit/>
+        </w:trPr>
+        <w:tc>
+          <w:tcPr>
+            <w:tcW w:type="dxa" w:w="2571"/>
+            <w:tcMar>
+              <w:top w:type="dxa" w:w="55"/>
+              <w:left w:type="dxa" w:w="100"/>
+              <w:bottom w:type="dxa" w:w="55"/>
+              <w:right w:type="dxa" w:w="100"/>
+            </w:tcMar>
+          </w:tcPr>
+          <w:p>
+            <w:pPr>
+              <w:spacing w:after="0"/>
+            </w:pPr>
+            <w:r>
+              <w:rPr>
+                <w:rFonts w:ascii="Consolas" w:hAnsi="Consolas" w:cs="Consolas"/>
+                <w:color w:val="E97132" w:themeColor="accent2"/>
+                <w:sz w:val="18"/>
+                <w:szCs w:val="18"/>
+              </w:rPr>
+              <w:t xml:space="preserve">D</w:t>
+            </w:r>
+          </w:p>
+        </w:tc>
+        <w:tc>
+          <w:tcPr>
+            <w:tcW w:type="dxa" w:w="2477"/>
+            <w:tcMar>
+              <w:top w:type="dxa" w:w="55"/>
+              <w:left w:type="dxa" w:w="100"/>
+              <w:bottom w:type="dxa" w:w="55"/>
+              <w:right w:type="dxa" w:w="100"/>
+            </w:tcMar>
+          </w:tcPr>
+          <w:p>
+            <w:pPr>
+              <w:spacing w:after="0"/>
+            </w:pPr>
+            <w:r>
+              <w:rPr>
+                <w:sz w:val="20"/>
+                <w:szCs w:val="20"/>
+              </w:rPr>
+              <w:t xml:space="preserve">celle de </w:t>
+            </w:r>
+            <w:r>
+              <w:rPr>
+                <w:rFonts w:ascii="Consolas" w:hAnsi="Consolas" w:cs="Consolas"/>
+                <w:color w:val="E97132" w:themeColor="accent2"/>
+                <w:sz w:val="18"/>
+                <w:szCs w:val="18"/>
+              </w:rPr>
+              <w:t xml:space="preserve">D</w:t>
+            </w:r>
+          </w:p>
+        </w:tc>
+        <w:tc>
+          <w:tcPr>
+            <w:tcW w:type="dxa" w:w="4312"/>
+            <w:tcMar>
+              <w:top w:type="dxa" w:w="55"/>
+              <w:left w:type="dxa" w:w="100"/>
+              <w:bottom w:type="dxa" w:w="55"/>
+              <w:right w:type="dxa" w:w="100"/>
+            </w:tcMar>
+          </w:tcPr>
+          <w:p>
+            <w:pPr>
+              <w:spacing w:after="0"/>
+            </w:pPr>
+            <w:r>
+              <w:rPr>
+                <w:rFonts w:ascii="Consolas" w:hAnsi="Consolas" w:cs="Consolas"/>
+                <w:color w:val="E97132" w:themeColor="accent2"/>
+                <w:sz w:val="18"/>
+                <w:szCs w:val="18"/>
+              </w:rPr>
+              <w:t xml:space="preserve">D</w:t>
+            </w:r>
+            <w:r>
+              <w:rPr>
+                <w:sz w:val="20"/>
+                <w:szCs w:val="20"/>
+              </w:rPr>
+              <w:t xml:space="preserve"> la redéfinit</w:t>
+            </w:r>
+          </w:p>
+        </w:tc>
+      </w:tr>
+      <w:tr>
+        <w:trPr>
+          <w:cantSplit/>
+        </w:trPr>
+        <w:tc>
+          <w:tcPr>
+            <w:tcW w:type="dxa" w:w="2571"/>
+            <w:tcMar>
+              <w:top w:type="dxa" w:w="55"/>
+              <w:left w:type="dxa" w:w="100"/>
+              <w:bottom w:type="dxa" w:w="55"/>
+              <w:right w:type="dxa" w:w="100"/>
+            </w:tcMar>
+          </w:tcPr>
+          <w:p>
+            <w:pPr>
+              <w:spacing w:after="0"/>
+            </w:pPr>
+            <w:r>
+              <w:rPr>
+                <w:rFonts w:ascii="Consolas" w:hAnsi="Consolas" w:cs="Consolas"/>
+                <w:color w:val="E97132" w:themeColor="accent2"/>
+                <w:sz w:val="18"/>
+                <w:szCs w:val="18"/>
+              </w:rPr>
+              <w:t xml:space="preserve">E</w:t>
+            </w:r>
+          </w:p>
+        </w:tc>
+        <w:tc>
+          <w:tcPr>
+            <w:tcW w:type="dxa" w:w="2477"/>
+            <w:tcMar>
+              <w:top w:type="dxa" w:w="55"/>
+              <w:left w:type="dxa" w:w="100"/>
+              <w:bottom w:type="dxa" w:w="55"/>
+              <w:right w:type="dxa" w:w="100"/>
+            </w:tcMar>
+          </w:tcPr>
+          <w:p>
+            <w:pPr>
+              <w:spacing w:after="0"/>
+            </w:pPr>
+            <w:r>
+              <w:rPr>
+                <w:sz w:val="20"/>
+                <w:szCs w:val="20"/>
+              </w:rPr>
+              <w:t xml:space="preserve">celle de </w:t>
+            </w:r>
+            <w:r>
+              <w:rPr>
+                <w:rFonts w:ascii="Consolas" w:hAnsi="Consolas" w:cs="Consolas"/>
+                <w:color w:val="E97132" w:themeColor="accent2"/>
+                <w:sz w:val="18"/>
+                <w:szCs w:val="18"/>
+              </w:rPr>
+              <w:t xml:space="preserve">A</w:t>
+            </w:r>
+          </w:p>
+        </w:tc>
+        <w:tc>
+          <w:tcPr>
+            <w:tcW w:type="dxa" w:w="4312"/>
+            <w:tcMar>
+              <w:top w:type="dxa" w:w="55"/>
+              <w:left w:type="dxa" w:w="100"/>
+              <w:bottom w:type="dxa" w:w="55"/>
+              <w:right w:type="dxa" w:w="100"/>
+            </w:tcMar>
+          </w:tcPr>
+          <w:p>
+            <w:pPr>
+              <w:spacing w:after="0"/>
+            </w:pPr>
+            <w:r>
+              <w:rPr>
+                <w:sz w:val="20"/>
+                <w:szCs w:val="20"/>
+              </w:rPr>
+              <w:t xml:space="preserve">ni </w:t>
+            </w:r>
+            <w:r>
+              <w:rPr>
+                <w:rFonts w:ascii="Consolas" w:hAnsi="Consolas" w:cs="Consolas"/>
+                <w:color w:val="E97132" w:themeColor="accent2"/>
+                <w:sz w:val="18"/>
+                <w:szCs w:val="18"/>
+              </w:rPr>
+              <w:t xml:space="preserve">E</w:t>
+            </w:r>
+            <w:r>
+              <w:rPr>
+                <w:sz w:val="20"/>
+                <w:szCs w:val="20"/>
+              </w:rPr>
+              <w:t xml:space="preserve"> ni </w:t>
+            </w:r>
+            <w:r>
+              <w:rPr>
+                <w:rFonts w:ascii="Consolas" w:hAnsi="Consolas" w:cs="Consolas"/>
+                <w:color w:val="E97132" w:themeColor="accent2"/>
+                <w:sz w:val="18"/>
+                <w:szCs w:val="18"/>
+              </w:rPr>
+              <w:t xml:space="preserve">B</w:t>
+            </w:r>
+            <w:r>
+              <w:rPr>
+                <w:sz w:val="20"/>
+                <w:szCs w:val="20"/>
+              </w:rPr>
+              <w:t xml:space="preserve"> ne l'écrivent</w:t>
+            </w:r>
+          </w:p>
+        </w:tc>
+      </w:tr>
+      <w:tr>
+        <w:trPr>
+          <w:cantSplit/>
+        </w:trPr>
+        <w:tc>
+          <w:tcPr>
+            <w:tcW w:type="dxa" w:w="2571"/>
+            <w:tcMar>
+              <w:top w:type="dxa" w:w="55"/>
+              <w:left w:type="dxa" w:w="100"/>
+              <w:bottom w:type="dxa" w:w="55"/>
+              <w:right w:type="dxa" w:w="100"/>
+            </w:tcMar>
+          </w:tcPr>
+          <w:p>
+            <w:pPr>
+              <w:spacing w:after="0"/>
+            </w:pPr>
+            <w:r>
+              <w:rPr>
+                <w:rFonts w:ascii="Consolas" w:hAnsi="Consolas" w:cs="Consolas"/>
+                <w:color w:val="E97132" w:themeColor="accent2"/>
+                <w:sz w:val="18"/>
+                <w:szCs w:val="18"/>
+              </w:rPr>
+              <w:t xml:space="preserve">F</w:t>
+            </w:r>
+          </w:p>
+        </w:tc>
+        <w:tc>
+          <w:tcPr>
+            <w:tcW w:type="dxa" w:w="2477"/>
+            <w:tcMar>
+              <w:top w:type="dxa" w:w="55"/>
+              <w:left w:type="dxa" w:w="100"/>
+              <w:bottom w:type="dxa" w:w="55"/>
+              <w:right w:type="dxa" w:w="100"/>
+            </w:tcMar>
+          </w:tcPr>
+          <w:p>
+            <w:pPr>
+              <w:spacing w:after="0"/>
+            </w:pPr>
+            <w:r>
+              <w:rPr>
+                <w:sz w:val="20"/>
+                <w:szCs w:val="20"/>
+              </w:rPr>
+              <w:t xml:space="preserve">celle de </w:t>
+            </w:r>
+            <w:r>
+              <w:rPr>
+                <w:rFonts w:ascii="Consolas" w:hAnsi="Consolas" w:cs="Consolas"/>
+                <w:color w:val="E97132" w:themeColor="accent2"/>
+                <w:sz w:val="18"/>
+                <w:szCs w:val="18"/>
+              </w:rPr>
+              <w:t xml:space="preserve">C</w:t>
+            </w:r>
+          </w:p>
+        </w:tc>
+        <w:tc>
+          <w:tcPr>
+            <w:tcW w:type="dxa" w:w="4312"/>
+            <w:tcMar>
+              <w:top w:type="dxa" w:w="55"/>
+              <w:left w:type="dxa" w:w="100"/>
+              <w:bottom w:type="dxa" w:w="55"/>
+              <w:right w:type="dxa" w:w="100"/>
+            </w:tcMar>
+          </w:tcPr>
+          <w:p>
+            <w:pPr>
+              <w:spacing w:after="0"/>
+            </w:pPr>
+            <w:r>
+              <w:rPr>
+                <w:rFonts w:ascii="Consolas" w:hAnsi="Consolas" w:cs="Consolas"/>
+                <w:color w:val="E97132" w:themeColor="accent2"/>
+                <w:sz w:val="18"/>
+                <w:szCs w:val="18"/>
+              </w:rPr>
+              <w:t xml:space="preserve">F</w:t>
+            </w:r>
+            <w:r>
+              <w:rPr>
+                <w:sz w:val="20"/>
+                <w:szCs w:val="20"/>
+              </w:rPr>
+              <w:t xml:space="preserve"> ne l'écrit pas, </w:t>
+            </w:r>
+            <w:r>
+              <w:rPr>
+                <w:rFonts w:ascii="Consolas" w:hAnsi="Consolas" w:cs="Consolas"/>
+                <w:color w:val="E97132" w:themeColor="accent2"/>
+                <w:sz w:val="18"/>
+                <w:szCs w:val="18"/>
+              </w:rPr>
+              <w:t xml:space="preserve">C</w:t>
+            </w:r>
+            <w:r>
+              <w:rPr>
+                <w:sz w:val="20"/>
+                <w:szCs w:val="20"/>
+              </w:rPr>
+              <w:t xml:space="preserve"> oui</w:t>
+            </w:r>
+          </w:p>
+        </w:tc>
+      </w:tr>
+    </w:tbl>
+    <w:p>
+      <w:pPr>
+        <w:spacing w:after="60"/>
+      </w:pPr>
+    </w:p>
+    <w:p>
+      <w:pPr>
+        <w:spacing w:after="120"/>
+      </w:pPr>
+      <w:r>
+        <w:rPr>
+          <w:sz w:val="22"/>
+          <w:szCs w:val="22"/>
+        </w:rPr>
+        <w:t xml:space="preserve">Le type de la variable ne change rien : avec </w:t>
+      </w:r>
+      <w:r>
+        <w:rPr>
+          <w:rFonts w:ascii="Consolas" w:hAnsi="Consolas" w:cs="Consolas"/>
+          <w:color w:val="E97132" w:themeColor="accent2"/>
+          <w:sz w:val="18"/>
+          <w:szCs w:val="18"/>
+        </w:rPr>
+        <w:t xml:space="preserve">A x = new F();</w:t>
+      </w:r>
+      <w:r>
+        <w:rPr>
+          <w:sz w:val="22"/>
+          <w:szCs w:val="22"/>
+        </w:rPr>
+        <w:t xml:space="preserve">, l'appel </w:t>
+      </w:r>
+      <w:r>
+        <w:rPr>
+          <w:rFonts w:ascii="Consolas" w:hAnsi="Consolas" w:cs="Consolas"/>
+          <w:color w:val="E97132" w:themeColor="accent2"/>
+          <w:sz w:val="18"/>
+          <w:szCs w:val="18"/>
+        </w:rPr>
+        <w:t xml:space="preserve">x.truc()</w:t>
+      </w:r>
+      <w:r>
+        <w:rPr>
+          <w:sz w:val="22"/>
+          <w:szCs w:val="22"/>
+        </w:rPr>
+        <w:t xml:space="preserve"> exécute la version de </w:t>
+      </w:r>
+      <w:r>
+        <w:rPr>
+          <w:rFonts w:ascii="Consolas" w:hAnsi="Consolas" w:cs="Consolas"/>
+          <w:color w:val="E97132" w:themeColor="accent2"/>
+          <w:sz w:val="18"/>
+          <w:szCs w:val="18"/>
+        </w:rPr>
+        <w:t xml:space="preserve">C</w:t>
+      </w:r>
+      <w:r>
+        <w:rPr>
+          <w:sz w:val="22"/>
+          <w:szCs w:val="22"/>
+        </w:rPr>
+        <w:t xml:space="preserve">.</w:t>
+      </w:r>
+    </w:p>
+    <w:p>
+      <w:pPr>
+        <w:keepNext/>
+        <w:keepLines/>
+        <w:shd w:fill="F2F2F2" w:val="clear"/>
+        <w:spacing w:after="0" w:before="100"/>
+        <w:ind w:left="220"/>
+      </w:pPr>
+      <w:r>
+        <w:rPr>
+          <w:rFonts w:ascii="Consolas" w:hAnsi="Consolas" w:cs="Consolas"/>
+          <w:color w:val="E97132" w:themeColor="accent2"/>
+          <w:sz w:val="18"/>
+          <w:szCs w:val="18"/>
+        </w:rPr>
+        <w:t xml:space="preserve">public class D extends B {</w:t>
+      </w:r>
+    </w:p>
+    <w:p>
+      <w:pPr>
+        <w:keepNext/>
+        <w:keepLines/>
+        <w:shd w:fill="F2F2F2" w:val="clear"/>
+        <w:spacing w:after="0" w:before="0"/>
+        <w:ind w:left="220"/>
+      </w:pPr>
+      <w:r>
+        <w:rPr>
+          <w:rFonts w:ascii="Consolas" w:hAnsi="Consolas" w:cs="Consolas"/>
+          <w:color w:val="E97132" w:themeColor="accent2"/>
+          <w:sz w:val="18"/>
+          <w:szCs w:val="18"/>
+        </w:rPr>
+        <w:t xml:space="preserve">    @Override</w:t>
+      </w:r>
+    </w:p>
+    <w:p>
+      <w:pPr>
+        <w:keepNext/>
+        <w:keepLines/>
+        <w:shd w:fill="F2F2F2" w:val="clear"/>
+        <w:spacing w:after="0" w:before="0"/>
+        <w:ind w:left="220"/>
+      </w:pPr>
+      <w:r>
+        <w:rPr>
+          <w:rFonts w:ascii="Consolas" w:hAnsi="Consolas" w:cs="Consolas"/>
+          <w:color w:val="E97132" w:themeColor="accent2"/>
+          <w:sz w:val="18"/>
+          <w:szCs w:val="18"/>
+        </w:rPr>
+        <w:t xml:space="preserve">    public void truc() {</w:t>
+      </w:r>
+    </w:p>
+    <w:p>
+      <w:pPr>
+        <w:keepNext/>
+        <w:keepLines/>
+        <w:shd w:fill="F2F2F2" w:val="clear"/>
+        <w:spacing w:after="0" w:before="0"/>
+        <w:ind w:left="220"/>
+      </w:pPr>
+      <w:r>
+        <w:rPr>
+          <w:rFonts w:ascii="Consolas" w:hAnsi="Consolas" w:cs="Consolas"/>
+          <w:color w:val="E97132" w:themeColor="accent2"/>
+          <w:sz w:val="18"/>
+          <w:szCs w:val="18"/>
+        </w:rPr>
+        <w:t xml:space="preserve">        super.truc();          // la version dont dispose B : celle de A</w:t>
+      </w:r>
+    </w:p>
+    <w:p>
+      <w:pPr>
+        <w:keepNext/>
+        <w:keepLines/>
+        <w:shd w:fill="F2F2F2" w:val="clear"/>
+        <w:spacing w:after="0" w:before="0"/>
+        <w:ind w:left="220"/>
+      </w:pPr>
+      <w:r>
+        <w:rPr>
+          <w:rFonts w:ascii="Consolas" w:hAnsi="Consolas" w:cs="Consolas"/>
+          <w:color w:val="E97132" w:themeColor="accent2"/>
+          <w:sz w:val="18"/>
+          <w:szCs w:val="18"/>
+        </w:rPr>
+        <w:t xml:space="preserve">        System.out.println("et la suite propre a D");</w:t>
+      </w:r>
+    </w:p>
+    <w:p>
+      <w:pPr>
+        <w:keepNext/>
+        <w:keepLines/>
+        <w:shd w:fill="F2F2F2" w:val="clear"/>
+        <w:spacing w:after="0" w:before="0"/>
+        <w:ind w:left="220"/>
+      </w:pPr>
+      <w:r>
+        <w:rPr>
+          <w:rFonts w:ascii="Consolas" w:hAnsi="Consolas" w:cs="Consolas"/>
+          <w:color w:val="E97132" w:themeColor="accent2"/>
+          <w:sz w:val="18"/>
+          <w:szCs w:val="18"/>
+        </w:rPr>
+        <w:t xml:space="preserve">    }</w:t>
+      </w:r>
+    </w:p>
+    <w:p>
+      <w:pPr>
+        <w:keepNext w:val="false"/>
+        <w:keepLines/>
+        <w:shd w:fill="F2F2F2" w:val="clear"/>
+        <w:spacing w:after="160" w:before="0"/>
+        <w:ind w:left="220"/>
+      </w:pPr>
+      <w:r>
+        <w:rPr>
+          <w:rFonts w:ascii="Consolas" w:hAnsi="Consolas" w:cs="Consolas"/>
+          <w:color w:val="E97132" w:themeColor="accent2"/>
+          <w:sz w:val="18"/>
+          <w:szCs w:val="18"/>
+        </w:rPr>
+        <w:t xml:space="preserve">}</w:t>
+      </w:r>
+    </w:p>
+    <w:p>
+      <w:pPr>
+        <w:spacing w:after="120"/>
+      </w:pPr>
+      <w:r>
+        <w:rPr>
+          <w:sz w:val="22"/>
+          <w:szCs w:val="22"/>
+        </w:rPr>
+        <w:t xml:space="preserve">Dans </w:t>
+      </w:r>
+      <w:r>
+        <w:rPr>
+          <w:rFonts w:ascii="Consolas" w:hAnsi="Consolas" w:cs="Consolas"/>
+          <w:color w:val="E97132" w:themeColor="accent2"/>
+          <w:sz w:val="18"/>
+          <w:szCs w:val="18"/>
+        </w:rPr>
+        <w:t xml:space="preserve">D</w:t>
+      </w:r>
+      <w:r>
+        <w:rPr>
+          <w:sz w:val="22"/>
+          <w:szCs w:val="22"/>
+        </w:rPr>
+        <w:t xml:space="preserve">, </w:t>
+      </w:r>
+      <w:r>
+        <w:rPr>
+          <w:rFonts w:ascii="Consolas" w:hAnsi="Consolas" w:cs="Consolas"/>
+          <w:color w:val="E97132" w:themeColor="accent2"/>
+          <w:sz w:val="18"/>
+          <w:szCs w:val="18"/>
+        </w:rPr>
+        <w:t xml:space="preserve">super.truc()</w:t>
+      </w:r>
+      <w:r>
+        <w:rPr>
+          <w:sz w:val="22"/>
+          <w:szCs w:val="22"/>
+        </w:rPr>
+        <w:t xml:space="preserve"> ne désigne pas forcément une méthode écrite dans </w:t>
+      </w:r>
+      <w:r>
+        <w:rPr>
+          <w:rFonts w:ascii="Consolas" w:hAnsi="Consolas" w:cs="Consolas"/>
+          <w:color w:val="E97132" w:themeColor="accent2"/>
+          <w:sz w:val="18"/>
+          <w:szCs w:val="18"/>
+        </w:rPr>
+        <w:t xml:space="preserve">B</w:t>
+      </w:r>
+      <w:r>
+        <w:rPr>
+          <w:sz w:val="22"/>
+          <w:szCs w:val="22"/>
+        </w:rPr>
+        <w:t xml:space="preserve">, la mère directe : il désigne la version dont </w:t>
+      </w:r>
+      <w:r>
+        <w:rPr>
+          <w:rFonts w:ascii="Consolas" w:hAnsi="Consolas" w:cs="Consolas"/>
+          <w:color w:val="E97132" w:themeColor="accent2"/>
+          <w:sz w:val="18"/>
+          <w:szCs w:val="18"/>
+        </w:rPr>
+        <w:t xml:space="preserve">B</w:t>
+      </w:r>
+      <w:r>
+        <w:rPr>
+          <w:sz w:val="22"/>
+          <w:szCs w:val="22"/>
+        </w:rPr>
+        <w:t xml:space="preserve"> dispose, c'est-à-dire la plus proche en remontant. Ici, </w:t>
+      </w:r>
+      <w:r>
+        <w:rPr>
+          <w:rFonts w:ascii="Consolas" w:hAnsi="Consolas" w:cs="Consolas"/>
+          <w:color w:val="E97132" w:themeColor="accent2"/>
+          <w:sz w:val="18"/>
+          <w:szCs w:val="18"/>
+        </w:rPr>
+        <w:t xml:space="preserve">B</w:t>
+      </w:r>
+      <w:r>
+        <w:rPr>
+          <w:sz w:val="22"/>
+          <w:szCs w:val="22"/>
+        </w:rPr>
+        <w:t xml:space="preserve"> n'écrit pas </w:t>
+      </w:r>
+      <w:r>
+        <w:rPr>
+          <w:rFonts w:ascii="Consolas" w:hAnsi="Consolas" w:cs="Consolas"/>
+          <w:color w:val="E97132" w:themeColor="accent2"/>
+          <w:sz w:val="18"/>
+          <w:szCs w:val="18"/>
+        </w:rPr>
+        <w:t xml:space="preserve">truc()</w:t>
+      </w:r>
+      <w:r>
+        <w:rPr>
+          <w:sz w:val="22"/>
+          <w:szCs w:val="22"/>
+        </w:rPr>
+        <w:t xml:space="preserve">, c'est donc celle de </w:t>
+      </w:r>
+      <w:r>
+        <w:rPr>
+          <w:rFonts w:ascii="Consolas" w:hAnsi="Consolas" w:cs="Consolas"/>
+          <w:color w:val="E97132" w:themeColor="accent2"/>
+          <w:sz w:val="18"/>
+          <w:szCs w:val="18"/>
+        </w:rPr>
+        <w:t xml:space="preserve">A</w:t>
+      </w:r>
+      <w:r>
+        <w:rPr>
+          <w:sz w:val="22"/>
+          <w:szCs w:val="22"/>
+        </w:rPr>
+        <w:t xml:space="preserve"> qui s'exécute.</w:t>
+      </w:r>
+    </w:p>
+    <w:p>
+      <w:pPr>
+        <w:pStyle w:val="Heading2"/>
+        <w:keepNext/>
+        <w:spacing w:after="100" w:before="240"/>
+      </w:pPr>
+      <w:r>
+        <w:rPr>
+          <w:b/>
+          <w:bCs/>
+          <w:color w:val="595959"/>
+          <w:sz w:val="24"/>
+          <w:szCs w:val="24"/>
+        </w:rPr>
         <w:t xml:space="preserve">Ni </w:t>
       </w:r>
       <w:r>
@@ -5997,7 +7149,7 @@
                     </pic:cNvPicPr>
                   </pic:nvPicPr>
                   <pic:blipFill>
-                    <a:blip r:embed="rId9" cstate="none"/>
+                    <a:blip r:embed="rId10" cstate="none"/>
                     <a:srcRect/>
                     <a:stretch>
                       <a:fillRect/>
@@ -7063,7 +8215,7 @@
                     </pic:cNvPicPr>
                   </pic:nvPicPr>
                   <pic:blipFill>
-                    <a:blip r:embed="rId10" cstate="none"/>
+                    <a:blip r:embed="rId11" cstate="none"/>
                     <a:srcRect/>
                     <a:stretch>
                       <a:fillRect/>
@@ -8435,8 +9587,8 @@
       </w:r>
     </w:p>
     <w:sectPr>
-      <w:headerReference w:type="default" r:id="rId14"/>
-      <w:footerReference w:type="default" r:id="rId16"/>
+      <w:headerReference w:type="default" r:id="rId15"/>
+      <w:footerReference w:type="default" r:id="rId17"/>
       <w:pgSz w:w="11906" w:h="16838" w:orient="portrait"/>
       <w:pgMar w:top="1440" w:right="1440" w:bottom="1440" w:left="1440" w:header="708" w:footer="708" w:gutter="0"/>
       <w:pgNumType w:start="1"/>
@@ -8539,7 +9691,7 @@
       <w:fldChar w:fldCharType="separate"/>
     </w:r>
     <w:r>
-      <w:t>12</w:t>
+      <w:t>13</w:t>
     </w:r>
     <w:r>
       <w:fldChar w:fldCharType="end"/>

</xml_diff>